<commit_message>
fix: add error examples and preserve UTF-8 report text
</commit_message>
<xml_diff>
--- a/final_report.docx
+++ b/final_report.docx
@@ -12,7 +12,7 @@
     </w:p>
     <w:p>
       <w:r>
-        <w:t>NLP Final Project — Full Fine-tuning vs. LoRA/PEFT on a shared base model. July 12, 2026.</w:t>
+        <w:t>NLP Final Project — Full Fine-tuning vs. LoRA/PEFT on a shared base model. July 14, 2026.</w:t>
       </w:r>
     </w:p>
     <w:p>
@@ -1114,22 +1114,23 @@
         <w:tblLook w:firstColumn="1" w:firstRow="1" w:lastColumn="0" w:lastRow="0" w:noHBand="0" w:noVBand="1" w:val="04A0"/>
       </w:tblPr>
       <w:tblGrid>
-        <w:gridCol w:w="1994"/>
-        <w:gridCol w:w="1994"/>
-        <w:gridCol w:w="1994"/>
-        <w:gridCol w:w="1994"/>
-        <w:gridCol w:w="1994"/>
+        <w:gridCol w:w="1662"/>
+        <w:gridCol w:w="1662"/>
+        <w:gridCol w:w="1662"/>
+        <w:gridCol w:w="1662"/>
+        <w:gridCol w:w="1662"/>
+        <w:gridCol w:w="1662"/>
       </w:tblGrid>
       <w:tr>
         <w:tc>
           <w:tcPr>
-            <w:tcW w:type="dxa" w:w="1994"/>
+            <w:tcW w:type="dxa" w:w="1662"/>
           </w:tcPr>
           <w:p>
             <w:r>
               <w:rPr>
                 <w:b/>
-                <w:sz w:val="19"/>
+                <w:sz w:val="18"/>
               </w:rPr>
               <w:t>Model</w:t>
             </w:r>
@@ -1137,13 +1138,13 @@
         </w:tc>
         <w:tc>
           <w:tcPr>
-            <w:tcW w:type="dxa" w:w="1994"/>
+            <w:tcW w:type="dxa" w:w="1662"/>
           </w:tcPr>
           <w:p>
             <w:r>
               <w:rPr>
                 <w:b/>
-                <w:sz w:val="19"/>
+                <w:sz w:val="18"/>
               </w:rPr>
               <w:t>BLEU</w:t>
             </w:r>
@@ -1151,13 +1152,13 @@
         </w:tc>
         <w:tc>
           <w:tcPr>
-            <w:tcW w:type="dxa" w:w="1994"/>
+            <w:tcW w:type="dxa" w:w="1662"/>
           </w:tcPr>
           <w:p>
             <w:r>
               <w:rPr>
                 <w:b/>
-                <w:sz w:val="19"/>
+                <w:sz w:val="18"/>
               </w:rPr>
               <w:t>chrF</w:t>
             </w:r>
@@ -1165,13 +1166,13 @@
         </w:tc>
         <w:tc>
           <w:tcPr>
-            <w:tcW w:type="dxa" w:w="1994"/>
+            <w:tcW w:type="dxa" w:w="1662"/>
           </w:tcPr>
           <w:p>
             <w:r>
               <w:rPr>
                 <w:b/>
-                <w:sz w:val="19"/>
+                <w:sz w:val="18"/>
               </w:rPr>
               <w:t>Average output length (words)</w:t>
             </w:r>
@@ -1179,15 +1180,29 @@
         </w:tc>
         <w:tc>
           <w:tcPr>
-            <w:tcW w:type="dxa" w:w="1994"/>
+            <w:tcW w:type="dxa" w:w="1662"/>
           </w:tcPr>
           <w:p>
             <w:r>
               <w:rPr>
                 <w:b/>
-                <w:sz w:val="19"/>
+                <w:sz w:val="18"/>
               </w:rPr>
               <w:t>Inference sec / 100</w:t>
+            </w:r>
+          </w:p>
+        </w:tc>
+        <w:tc>
+          <w:tcPr>
+            <w:tcW w:type="dxa" w:w="1662"/>
+          </w:tcPr>
+          <w:p>
+            <w:r>
+              <w:rPr>
+                <w:b/>
+                <w:sz w:val="18"/>
+              </w:rPr>
+              <w:t>Error example (worst case)</w:t>
             </w:r>
           </w:p>
         </w:tc>
@@ -1195,12 +1210,12 @@
       <w:tr>
         <w:tc>
           <w:tcPr>
-            <w:tcW w:type="dxa" w:w="1994"/>
+            <w:tcW w:type="dxa" w:w="1662"/>
           </w:tcPr>
           <w:p>
             <w:r>
               <w:rPr>
-                <w:sz w:val="19"/>
+                <w:sz w:val="18"/>
               </w:rPr>
               <w:t>Model A (Full FT)</w:t>
             </w:r>
@@ -1208,12 +1223,12 @@
         </w:tc>
         <w:tc>
           <w:tcPr>
-            <w:tcW w:type="dxa" w:w="1994"/>
+            <w:tcW w:type="dxa" w:w="1662"/>
           </w:tcPr>
           <w:p>
             <w:r>
               <w:rPr>
-                <w:sz w:val="19"/>
+                <w:sz w:val="18"/>
               </w:rPr>
               <w:t>6.11</w:t>
             </w:r>
@@ -1221,12 +1236,12 @@
         </w:tc>
         <w:tc>
           <w:tcPr>
-            <w:tcW w:type="dxa" w:w="1994"/>
+            <w:tcW w:type="dxa" w:w="1662"/>
           </w:tcPr>
           <w:p>
             <w:r>
               <w:rPr>
-                <w:sz w:val="19"/>
+                <w:sz w:val="18"/>
               </w:rPr>
               <w:t>29.51</w:t>
             </w:r>
@@ -1234,12 +1249,12 @@
         </w:tc>
         <w:tc>
           <w:tcPr>
-            <w:tcW w:type="dxa" w:w="1994"/>
+            <w:tcW w:type="dxa" w:w="1662"/>
           </w:tcPr>
           <w:p>
             <w:r>
               <w:rPr>
-                <w:sz w:val="19"/>
+                <w:sz w:val="18"/>
               </w:rPr>
               <w:t>14.69</w:t>
             </w:r>
@@ -1247,14 +1262,27 @@
         </w:tc>
         <w:tc>
           <w:tcPr>
-            <w:tcW w:type="dxa" w:w="1994"/>
+            <w:tcW w:type="dxa" w:w="1662"/>
           </w:tcPr>
           <w:p>
             <w:r>
               <w:rPr>
-                <w:sz w:val="19"/>
+                <w:sz w:val="18"/>
               </w:rPr>
               <w:t>7.6</w:t>
+            </w:r>
+          </w:p>
+        </w:tc>
+        <w:tc>
+          <w:tcPr>
+            <w:tcW w:type="dxa" w:w="1662"/>
+          </w:tcPr>
+          <w:p>
+            <w:r>
+              <w:rPr>
+                <w:sz w:val="18"/>
+              </w:rPr>
+              <w:t>'Exactly so,' said the Hatter: 'as the things get used up.' -&gt; '-' (gold: '« Justement, » dit le Chapelier, « à mesure que les tasses ont servi. »')</w:t>
             </w:r>
           </w:p>
         </w:tc>
@@ -1262,12 +1290,12 @@
       <w:tr>
         <w:tc>
           <w:tcPr>
-            <w:tcW w:type="dxa" w:w="1994"/>
+            <w:tcW w:type="dxa" w:w="1662"/>
           </w:tcPr>
           <w:p>
             <w:r>
               <w:rPr>
-                <w:sz w:val="19"/>
+                <w:sz w:val="18"/>
               </w:rPr>
               <w:t>Model B (LoRA)</w:t>
             </w:r>
@@ -1275,12 +1303,12 @@
         </w:tc>
         <w:tc>
           <w:tcPr>
-            <w:tcW w:type="dxa" w:w="1994"/>
+            <w:tcW w:type="dxa" w:w="1662"/>
           </w:tcPr>
           <w:p>
             <w:r>
               <w:rPr>
-                <w:sz w:val="19"/>
+                <w:sz w:val="18"/>
               </w:rPr>
               <w:t>5.76</w:t>
             </w:r>
@@ -1288,12 +1316,12 @@
         </w:tc>
         <w:tc>
           <w:tcPr>
-            <w:tcW w:type="dxa" w:w="1994"/>
+            <w:tcW w:type="dxa" w:w="1662"/>
           </w:tcPr>
           <w:p>
             <w:r>
               <w:rPr>
-                <w:sz w:val="19"/>
+                <w:sz w:val="18"/>
               </w:rPr>
               <w:t>28.56</w:t>
             </w:r>
@@ -1301,12 +1329,12 @@
         </w:tc>
         <w:tc>
           <w:tcPr>
-            <w:tcW w:type="dxa" w:w="1994"/>
+            <w:tcW w:type="dxa" w:w="1662"/>
           </w:tcPr>
           <w:p>
             <w:r>
               <w:rPr>
-                <w:sz w:val="19"/>
+                <w:sz w:val="18"/>
               </w:rPr>
               <w:t>14.26</w:t>
             </w:r>
@@ -1314,14 +1342,27 @@
         </w:tc>
         <w:tc>
           <w:tcPr>
-            <w:tcW w:type="dxa" w:w="1994"/>
+            <w:tcW w:type="dxa" w:w="1662"/>
           </w:tcPr>
           <w:p>
             <w:r>
               <w:rPr>
-                <w:sz w:val="19"/>
+                <w:sz w:val="18"/>
               </w:rPr>
               <w:t>8.2</w:t>
+            </w:r>
+          </w:p>
+        </w:tc>
+        <w:tc>
+          <w:tcPr>
+            <w:tcW w:type="dxa" w:w="1662"/>
+          </w:tcPr>
+          <w:p>
+            <w:r>
+              <w:rPr>
+                <w:sz w:val="18"/>
+              </w:rPr>
+              <w:t>"Coral insects," replied Cyrus Harding. -&gt; '--' (gold: '-- Les infusoires du corail, répondit Cyrus Smith.')</w:t>
             </w:r>
           </w:p>
         </w:tc>
@@ -1329,12 +1370,12 @@
       <w:tr>
         <w:tc>
           <w:tcPr>
-            <w:tcW w:type="dxa" w:w="1994"/>
+            <w:tcW w:type="dxa" w:w="1662"/>
           </w:tcPr>
           <w:p>
             <w:r>
               <w:rPr>
-                <w:sz w:val="19"/>
+                <w:sz w:val="18"/>
               </w:rPr>
               <w:t>B-A</w:t>
             </w:r>
@@ -1342,12 +1383,12 @@
         </w:tc>
         <w:tc>
           <w:tcPr>
-            <w:tcW w:type="dxa" w:w="1994"/>
+            <w:tcW w:type="dxa" w:w="1662"/>
           </w:tcPr>
           <w:p>
             <w:r>
               <w:rPr>
-                <w:sz w:val="19"/>
+                <w:sz w:val="18"/>
               </w:rPr>
               <w:t>-0.35</w:t>
             </w:r>
@@ -1355,12 +1396,12 @@
         </w:tc>
         <w:tc>
           <w:tcPr>
-            <w:tcW w:type="dxa" w:w="1994"/>
+            <w:tcW w:type="dxa" w:w="1662"/>
           </w:tcPr>
           <w:p>
             <w:r>
               <w:rPr>
-                <w:sz w:val="19"/>
+                <w:sz w:val="18"/>
               </w:rPr>
               <w:t>-0.95</w:t>
             </w:r>
@@ -1368,12 +1409,12 @@
         </w:tc>
         <w:tc>
           <w:tcPr>
-            <w:tcW w:type="dxa" w:w="1994"/>
+            <w:tcW w:type="dxa" w:w="1662"/>
           </w:tcPr>
           <w:p>
             <w:r>
               <w:rPr>
-                <w:sz w:val="19"/>
+                <w:sz w:val="18"/>
               </w:rPr>
               <w:t>-0.43</w:t>
             </w:r>
@@ -1381,14 +1422,26 @@
         </w:tc>
         <w:tc>
           <w:tcPr>
-            <w:tcW w:type="dxa" w:w="1994"/>
+            <w:tcW w:type="dxa" w:w="1662"/>
           </w:tcPr>
           <w:p>
             <w:r>
               <w:rPr>
-                <w:sz w:val="19"/>
+                <w:sz w:val="18"/>
               </w:rPr>
               <w:t>0.6</w:t>
+            </w:r>
+          </w:p>
+        </w:tc>
+        <w:tc>
+          <w:tcPr>
+            <w:tcW w:type="dxa" w:w="1662"/>
+          </w:tcPr>
+          <w:p>
+            <w:r>
+              <w:rPr>
+                <w:sz w:val="18"/>
+              </w:rPr>
             </w:r>
           </w:p>
         </w:tc>
@@ -1416,23 +1469,24 @@
         <w:tblLook w:firstColumn="1" w:firstRow="1" w:lastColumn="0" w:lastRow="0" w:noHBand="0" w:noVBand="1" w:val="04A0"/>
       </w:tblPr>
       <w:tblGrid>
-        <w:gridCol w:w="1662"/>
-        <w:gridCol w:w="1662"/>
-        <w:gridCol w:w="1662"/>
-        <w:gridCol w:w="1662"/>
-        <w:gridCol w:w="1662"/>
-        <w:gridCol w:w="1662"/>
+        <w:gridCol w:w="1425"/>
+        <w:gridCol w:w="1425"/>
+        <w:gridCol w:w="1425"/>
+        <w:gridCol w:w="1425"/>
+        <w:gridCol w:w="1425"/>
+        <w:gridCol w:w="1425"/>
+        <w:gridCol w:w="1425"/>
       </w:tblGrid>
       <w:tr>
         <w:tc>
           <w:tcPr>
-            <w:tcW w:type="dxa" w:w="1662"/>
+            <w:tcW w:type="dxa" w:w="1425"/>
           </w:tcPr>
           <w:p>
             <w:r>
               <w:rPr>
                 <w:b/>
-                <w:sz w:val="19"/>
+                <w:sz w:val="18"/>
               </w:rPr>
               <w:t>Model</w:t>
             </w:r>
@@ -1440,13 +1494,13 @@
         </w:tc>
         <w:tc>
           <w:tcPr>
-            <w:tcW w:type="dxa" w:w="1662"/>
+            <w:tcW w:type="dxa" w:w="1425"/>
           </w:tcPr>
           <w:p>
             <w:r>
               <w:rPr>
                 <w:b/>
-                <w:sz w:val="19"/>
+                <w:sz w:val="18"/>
               </w:rPr>
               <w:t>Exact Match</w:t>
             </w:r>
@@ -1454,13 +1508,13 @@
         </w:tc>
         <w:tc>
           <w:tcPr>
-            <w:tcW w:type="dxa" w:w="1662"/>
+            <w:tcW w:type="dxa" w:w="1425"/>
           </w:tcPr>
           <w:p>
             <w:r>
               <w:rPr>
                 <w:b/>
-                <w:sz w:val="19"/>
+                <w:sz w:val="18"/>
               </w:rPr>
               <w:t>Token F1</w:t>
             </w:r>
@@ -1468,13 +1522,13 @@
         </w:tc>
         <w:tc>
           <w:tcPr>
-            <w:tcW w:type="dxa" w:w="1662"/>
+            <w:tcW w:type="dxa" w:w="1425"/>
           </w:tcPr>
           <w:p>
             <w:r>
               <w:rPr>
                 <w:b/>
-                <w:sz w:val="19"/>
+                <w:sz w:val="18"/>
               </w:rPr>
               <w:t>Average answer length (words)</w:t>
             </w:r>
@@ -1482,13 +1536,13 @@
         </w:tc>
         <w:tc>
           <w:tcPr>
-            <w:tcW w:type="dxa" w:w="1662"/>
+            <w:tcW w:type="dxa" w:w="1425"/>
           </w:tcPr>
           <w:p>
             <w:r>
               <w:rPr>
                 <w:b/>
-                <w:sz w:val="19"/>
+                <w:sz w:val="18"/>
               </w:rPr>
               <w:t>Average gold length (words)</w:t>
             </w:r>
@@ -1496,15 +1550,29 @@
         </w:tc>
         <w:tc>
           <w:tcPr>
-            <w:tcW w:type="dxa" w:w="1662"/>
+            <w:tcW w:type="dxa" w:w="1425"/>
           </w:tcPr>
           <w:p>
             <w:r>
               <w:rPr>
                 <w:b/>
-                <w:sz w:val="19"/>
+                <w:sz w:val="18"/>
               </w:rPr>
               <w:t>Inference sec / 100</w:t>
+            </w:r>
+          </w:p>
+        </w:tc>
+        <w:tc>
+          <w:tcPr>
+            <w:tcW w:type="dxa" w:w="1425"/>
+          </w:tcPr>
+          <w:p>
+            <w:r>
+              <w:rPr>
+                <w:b/>
+                <w:sz w:val="18"/>
+              </w:rPr>
+              <w:t>Error example (worst case)</w:t>
             </w:r>
           </w:p>
         </w:tc>
@@ -1512,12 +1580,12 @@
       <w:tr>
         <w:tc>
           <w:tcPr>
-            <w:tcW w:type="dxa" w:w="1662"/>
+            <w:tcW w:type="dxa" w:w="1425"/>
           </w:tcPr>
           <w:p>
             <w:r>
               <w:rPr>
-                <w:sz w:val="19"/>
+                <w:sz w:val="18"/>
               </w:rPr>
               <w:t>Model A (Full FT)</w:t>
             </w:r>
@@ -1525,12 +1593,12 @@
         </w:tc>
         <w:tc>
           <w:tcPr>
-            <w:tcW w:type="dxa" w:w="1662"/>
+            <w:tcW w:type="dxa" w:w="1425"/>
           </w:tcPr>
           <w:p>
             <w:r>
               <w:rPr>
-                <w:sz w:val="19"/>
+                <w:sz w:val="18"/>
               </w:rPr>
               <w:t>0.78</w:t>
             </w:r>
@@ -1538,12 +1606,12 @@
         </w:tc>
         <w:tc>
           <w:tcPr>
-            <w:tcW w:type="dxa" w:w="1662"/>
+            <w:tcW w:type="dxa" w:w="1425"/>
           </w:tcPr>
           <w:p>
             <w:r>
               <w:rPr>
-                <w:sz w:val="19"/>
+                <w:sz w:val="18"/>
               </w:rPr>
               <w:t>0.8396</w:t>
             </w:r>
@@ -1551,12 +1619,12 @@
         </w:tc>
         <w:tc>
           <w:tcPr>
-            <w:tcW w:type="dxa" w:w="1662"/>
+            <w:tcW w:type="dxa" w:w="1425"/>
           </w:tcPr>
           <w:p>
             <w:r>
               <w:rPr>
-                <w:sz w:val="19"/>
+                <w:sz w:val="18"/>
               </w:rPr>
               <w:t>2.65</w:t>
             </w:r>
@@ -1564,12 +1632,12 @@
         </w:tc>
         <w:tc>
           <w:tcPr>
-            <w:tcW w:type="dxa" w:w="1662"/>
+            <w:tcW w:type="dxa" w:w="1425"/>
           </w:tcPr>
           <w:p>
             <w:r>
               <w:rPr>
-                <w:sz w:val="19"/>
+                <w:sz w:val="18"/>
               </w:rPr>
               <w:t>2.85</w:t>
             </w:r>
@@ -1577,14 +1645,27 @@
         </w:tc>
         <w:tc>
           <w:tcPr>
-            <w:tcW w:type="dxa" w:w="1662"/>
+            <w:tcW w:type="dxa" w:w="1425"/>
           </w:tcPr>
           <w:p>
             <w:r>
               <w:rPr>
-                <w:sz w:val="19"/>
+                <w:sz w:val="18"/>
               </w:rPr>
               <w:t>2.8</w:t>
+            </w:r>
+          </w:p>
+        </w:tc>
+        <w:tc>
+          <w:tcPr>
+            <w:tcW w:type="dxa" w:w="1425"/>
+          </w:tcPr>
+          <w:p>
+            <w:r>
+              <w:rPr>
+                <w:sz w:val="18"/>
+              </w:rPr>
+              <w:t>How often are elections held for the Victorian Parliament? -&gt; 'annually' (gold: 'every four years')</w:t>
             </w:r>
           </w:p>
         </w:tc>
@@ -1592,12 +1673,12 @@
       <w:tr>
         <w:tc>
           <w:tcPr>
-            <w:tcW w:type="dxa" w:w="1662"/>
+            <w:tcW w:type="dxa" w:w="1425"/>
           </w:tcPr>
           <w:p>
             <w:r>
               <w:rPr>
-                <w:sz w:val="19"/>
+                <w:sz w:val="18"/>
               </w:rPr>
               <w:t>Model B (LoRA)</w:t>
             </w:r>
@@ -1605,12 +1686,12 @@
         </w:tc>
         <w:tc>
           <w:tcPr>
-            <w:tcW w:type="dxa" w:w="1662"/>
+            <w:tcW w:type="dxa" w:w="1425"/>
           </w:tcPr>
           <w:p>
             <w:r>
               <w:rPr>
-                <w:sz w:val="19"/>
+                <w:sz w:val="18"/>
               </w:rPr>
               <w:t>0.77</w:t>
             </w:r>
@@ -1618,12 +1699,12 @@
         </w:tc>
         <w:tc>
           <w:tcPr>
-            <w:tcW w:type="dxa" w:w="1662"/>
+            <w:tcW w:type="dxa" w:w="1425"/>
           </w:tcPr>
           <w:p>
             <w:r>
               <w:rPr>
-                <w:sz w:val="19"/>
+                <w:sz w:val="18"/>
               </w:rPr>
               <w:t>0.8262</w:t>
             </w:r>
@@ -1631,12 +1712,12 @@
         </w:tc>
         <w:tc>
           <w:tcPr>
-            <w:tcW w:type="dxa" w:w="1662"/>
+            <w:tcW w:type="dxa" w:w="1425"/>
           </w:tcPr>
           <w:p>
             <w:r>
               <w:rPr>
-                <w:sz w:val="19"/>
+                <w:sz w:val="18"/>
               </w:rPr>
               <w:t>2.67</w:t>
             </w:r>
@@ -1644,12 +1725,12 @@
         </w:tc>
         <w:tc>
           <w:tcPr>
-            <w:tcW w:type="dxa" w:w="1662"/>
+            <w:tcW w:type="dxa" w:w="1425"/>
           </w:tcPr>
           <w:p>
             <w:r>
               <w:rPr>
-                <w:sz w:val="19"/>
+                <w:sz w:val="18"/>
               </w:rPr>
               <w:t>2.85</w:t>
             </w:r>
@@ -1657,14 +1738,27 @@
         </w:tc>
         <w:tc>
           <w:tcPr>
-            <w:tcW w:type="dxa" w:w="1662"/>
+            <w:tcW w:type="dxa" w:w="1425"/>
           </w:tcPr>
           <w:p>
             <w:r>
               <w:rPr>
-                <w:sz w:val="19"/>
+                <w:sz w:val="18"/>
               </w:rPr>
               <w:t>3.1</w:t>
+            </w:r>
+          </w:p>
+        </w:tc>
+        <w:tc>
+          <w:tcPr>
+            <w:tcW w:type="dxa" w:w="1425"/>
+          </w:tcPr>
+          <w:p>
+            <w:r>
+              <w:rPr>
+                <w:sz w:val="18"/>
+              </w:rPr>
+              <w:t>How often are elections held for the Victorian Parliament? -&gt; 'annually' (gold: 'every four years')</w:t>
             </w:r>
           </w:p>
         </w:tc>
@@ -1672,12 +1766,12 @@
       <w:tr>
         <w:tc>
           <w:tcPr>
-            <w:tcW w:type="dxa" w:w="1662"/>
+            <w:tcW w:type="dxa" w:w="1425"/>
           </w:tcPr>
           <w:p>
             <w:r>
               <w:rPr>
-                <w:sz w:val="19"/>
+                <w:sz w:val="18"/>
               </w:rPr>
               <w:t>B-A</w:t>
             </w:r>
@@ -1685,12 +1779,12 @@
         </w:tc>
         <w:tc>
           <w:tcPr>
-            <w:tcW w:type="dxa" w:w="1662"/>
+            <w:tcW w:type="dxa" w:w="1425"/>
           </w:tcPr>
           <w:p>
             <w:r>
               <w:rPr>
-                <w:sz w:val="19"/>
+                <w:sz w:val="18"/>
               </w:rPr>
               <w:t>-0.01</w:t>
             </w:r>
@@ -1698,12 +1792,12 @@
         </w:tc>
         <w:tc>
           <w:tcPr>
-            <w:tcW w:type="dxa" w:w="1662"/>
+            <w:tcW w:type="dxa" w:w="1425"/>
           </w:tcPr>
           <w:p>
             <w:r>
               <w:rPr>
-                <w:sz w:val="19"/>
+                <w:sz w:val="18"/>
               </w:rPr>
               <w:t>-0.0134</w:t>
             </w:r>
@@ -1711,12 +1805,12 @@
         </w:tc>
         <w:tc>
           <w:tcPr>
-            <w:tcW w:type="dxa" w:w="1662"/>
+            <w:tcW w:type="dxa" w:w="1425"/>
           </w:tcPr>
           <w:p>
             <w:r>
               <w:rPr>
-                <w:sz w:val="19"/>
+                <w:sz w:val="18"/>
               </w:rPr>
               <w:t>0.02</w:t>
             </w:r>
@@ -1724,12 +1818,12 @@
         </w:tc>
         <w:tc>
           <w:tcPr>
-            <w:tcW w:type="dxa" w:w="1662"/>
+            <w:tcW w:type="dxa" w:w="1425"/>
           </w:tcPr>
           <w:p>
             <w:r>
               <w:rPr>
-                <w:sz w:val="19"/>
+                <w:sz w:val="18"/>
               </w:rPr>
               <w:t>0.0</w:t>
             </w:r>
@@ -1737,14 +1831,26 @@
         </w:tc>
         <w:tc>
           <w:tcPr>
-            <w:tcW w:type="dxa" w:w="1662"/>
+            <w:tcW w:type="dxa" w:w="1425"/>
           </w:tcPr>
           <w:p>
             <w:r>
               <w:rPr>
-                <w:sz w:val="19"/>
+                <w:sz w:val="18"/>
               </w:rPr>
               <w:t>0.3</w:t>
+            </w:r>
+          </w:p>
+        </w:tc>
+        <w:tc>
+          <w:tcPr>
+            <w:tcW w:type="dxa" w:w="1425"/>
+          </w:tcPr>
+          <w:p>
+            <w:r>
+              <w:rPr>
+                <w:sz w:val="18"/>
+              </w:rPr>
             </w:r>
           </w:p>
         </w:tc>

</xml_diff>

<commit_message>
Update final report document with latest findings
</commit_message>
<xml_diff>
--- a/final_report.docx
+++ b/final_report.docx
@@ -12,7 +12,7 @@
     </w:p>
     <w:p>
       <w:r>
-        <w:t>NLP Final Project — Full Fine-tuning vs. LoRA/PEFT on a shared base model. July 14, 2026.</w:t>
+        <w:t>NLP Final Project - Full Fine-tuning vs. LoRA/PEFT on a shared base model. July 14, 2026.</w:t>
       </w:r>
     </w:p>
     <w:p>
@@ -20,9 +20,9 @@
         <w:rPr>
           <w:b/>
         </w:rPr>
-        <w:t>Ronen Shershnev — ID 322217175</w:t>
+        <w:t>Ronen Shershnev - ID 322217175</w:t>
         <w:br/>
-        <w:t>Vladislav Pavliyuk — ID 332294891</w:t>
+        <w:t>Vladislav Pavliyuk - ID 332294891</w:t>
       </w:r>
     </w:p>
     <w:p>
@@ -35,7 +35,7 @@
     </w:p>
     <w:p>
       <w:r>
-        <w:t>Two models were trained from the same base model, google/flan-t5-small (76,961,152 parameters), and compared on three tasks: sentiment classification (SST-2), English→French translation (OPUS Books) and extractive question answering (SQuAD v1.1). Model A updates every weight (full fine-tuning); Model B trains LoRA adapters (r=16, α=32, on the q and v attention projections) — 688,128 trainable parameters, 0.8862% of the model. Each model is a single multi-task system: one training run over a shuffled mix of all three tasks in a unified text-to-text format, with a task prefix selecting the behavior:</w:t>
+        <w:t>Two models were trained from the same base model, google/flan-t5-small (76,961,152 parameters), and compared on three tasks: sentiment classification (SST-2), English→French translation (OPUS Books) and extractive question answering (SQuAD v1.1). Model A updates every weight (full fine-tuning); Model B trains LoRA adapters (r=16, α=32, on the q and v attention projections). This adds 688,128 trainable parameters, 0.8862% of the model. Each model is a single multi-task system: one training run over a shuffled mix of all three tasks in a unified text-to-text format, with a task prefix selecting the behavior:</w:t>
       </w:r>
     </w:p>
     <w:p>
@@ -85,7 +85,7 @@
           <w:b/>
           <w:sz w:val="20"/>
         </w:rPr>
-        <w:t>Table 1 — Model and training details</w:t>
+        <w:t>Table 1 - Model and training details</w:t>
       </w:r>
     </w:p>
     <w:tbl>
@@ -697,7 +697,7 @@
           <w:b/>
           <w:sz w:val="20"/>
         </w:rPr>
-        <w:t>Table 2 — Classification (SST-2)</w:t>
+        <w:t>Table 2 - Classification (SST-2)</w:t>
       </w:r>
     </w:p>
     <w:tbl>
@@ -1103,7 +1103,7 @@
           <w:b/>
           <w:sz w:val="20"/>
         </w:rPr>
-        <w:t>Table 3 — Translation (OPUS Books, English→French)</w:t>
+        <w:t>Table 3 - Translation (OPUS Books, English→French)</w:t>
       </w:r>
     </w:p>
     <w:tbl>
@@ -1458,7 +1458,7 @@
           <w:b/>
           <w:sz w:val="20"/>
         </w:rPr>
-        <w:t>Table 4 — Question Answering (SQuAD v1.1)</w:t>
+        <w:t>Table 4 - Question Answering (SQuAD v1.1)</w:t>
       </w:r>
     </w:p>
     <w:tbl>
@@ -1875,7 +1875,7 @@
           <w:b/>
           <w:sz w:val="20"/>
         </w:rPr>
-        <w:t>Table 5 — Normalized scores and computational cost</w:t>
+        <w:t>Table 5 - Normalized scores and computational cost</w:t>
       </w:r>
     </w:p>
     <w:tbl>
@@ -2293,7 +2293,7 @@
           <w:b/>
           <w:sz w:val="20"/>
         </w:rPr>
-        <w:t>Table 6 — Qualitative examples</w:t>
+        <w:t>Table 6 - Qualitative examples</w:t>
       </w:r>
     </w:p>
     <w:tbl>
@@ -2896,7 +2896,7 @@
     </w:p>
     <w:p>
       <w:r>
-        <w:t>Full fine-tuning (Model A) won all three tasks, by consistently small margins: classification Macro-F1 0.840 vs. 0.835 (−0.005), translation BLEU 6.11 vs. 5.76 (−0.35; chrF 29.51 vs. 28.56), and QA token-F1 0.840 vs. 0.826 (−0.013, the largest gap — −1.34 normalized points). In exchange, LoRA trained in 7.0 minutes vs. 12.1 (−42%) and its checkpoint is 5.0 MB vs. 295.9 MB (59× smaller).</w:t>
+        <w:t>Full fine-tuning (Model A) won all three tasks, by consistently small margins: classification Macro-F1 0.840 vs. 0.835 (−0.005), translation BLEU 6.11 vs. 5.76 (−0.35; chrF 29.51 vs. 28.56), and QA token-F1 0.840 vs. 0.826 (−0.013, the largest gap - −1.34 normalized points). In exchange, LoRA trained in 7.0 minutes vs. 12.1 (−42%) and its checkpoint is 5.0 MB vs. 295.9 MB (59× smaller).</w:t>
       </w:r>
     </w:p>
     <w:p>
@@ -2909,7 +2909,7 @@
     </w:p>
     <w:p>
       <w:r>
-        <w:t>Yes — the ranking A ≥ B held on every metric of every task; there was no task where LoRA overtook full fine-tuning. More striking is how similar the two models are at the level of individual predictions: on classification they gave the same correctness outcome on 195/200 test examples (165 both correct, 30 both wrong, only 5 disagreements), and on QA exact-match on 190/200 (150 both correct, 40 both wrong). Both models also share the same task profile — strong on extractive QA and binary sentiment, weak on literary translation. This suggests that with 1,000 examples per task, behavior is dominated by the shared base model and shared data; updating 0.89% of parameters is enough to track full fine-tuning almost exactly.</w:t>
+        <w:t>Yes. The ranking A ≥ B held on every metric of every task; there was no task where LoRA overtook full fine-tuning. More striking is how similar the two models are at the level of individual predictions: on classification they gave the same correctness outcome on 195/200 test examples (165 both correct, 30 both wrong, only 5 disagreements), and on QA exact-match on 190/200 (150 both correct, 40 both wrong). Both models also share the same task profile - strong on extractive QA and binary sentiment, weak on literary translation. This suggests that with 1,000 examples per task, behavior is dominated by the shared base model and shared data; updating 0.89% of parameters is enough to track full fine-tuning almost exactly.</w:t>
       </w:r>
     </w:p>
     <w:p>
@@ -2922,7 +2922,7 @@
     </w:p>
     <w:p>
       <w:r>
-        <w:t>Largely no. Full fine-tuning trained 112× more parameters (76,961,152 vs. 688,128), took 73% longer (12.1 vs. 7.0 min), and stores a 59× larger checkpoint, for +0.72 overall points (58.01 vs. 57.29) — LoRA reaches 98.8% of full fine-tuning's overall score. At this model and data scale, LoRA is clearly the better cost/quality trade-off; full fine-tuning is defensible only when every fraction of a point matters. One nuance favors full fine-tuning at inference: the unmerged LoRA adapters add computation, making Model B ~8% slower (4.0 vs. 3.7 sec/100 examples). This penalty is avoidable by merging the adapters into the base weights after training.</w:t>
+        <w:t>Largely no. Full fine-tuning trained 112× more parameters (76,961,152 vs. 688,128), took 73% longer (12.1 vs. 7.0 min), and stores a 59× larger checkpoint, for +0.72 overall points (58.01 vs. 57.29). LoRA reaches 98.8% of full fine-tuning's overall score. At this model and data scale, LoRA is clearly the better cost/quality trade-off; full fine-tuning is defensible only when every fraction of a point matters. One nuance favors full fine-tuning at inference: the unmerged LoRA adapters add computation, making Model B ~8% slower (4.0 vs. 3.7 sec/100 examples). This penalty is avoidable by merging the adapters into the base weights after training.</w:t>
       </w:r>
     </w:p>
     <w:p>
@@ -2935,7 +2935,7 @@
     </w:p>
     <w:p>
       <w:r>
-        <w:t>Failures were overwhelmingly shared rather than model-specific (A-only failures: 3 classification / 6 QA; B-only: 2 / 4), so the patterns below describe both models. Classification: errors concentrate on figurative or contrastive positive reviews — e.g. “you'll gasp appalled and laugh outraged” (gold positive, both predicted negative) — and on sarcasm — “i'll bet the video game is a lot more fun than the film” (gold negative, both predicted positive). Both models lean on surface sentiment words; errors skew toward the positive class (A missed 19/107 positives vs. 13/93 negatives). Translation: quality is bimodal — short, dialogue-like sentences translate acceptably while dense literary prose fails (49 of 200 sentences below chrF 20 for A, 52 for B, vs. 16/13 above chrF 50); typical errors are wrong rare vocabulary and untranslated English words carried into the output (8/200 for A, 7/200 for B). QA: both models fail on questions requiring inference or paraphrase rather than span extraction — “how/why” questions get a copied context sentence (the Antigone example in Table 6, token-F1 0.06), and several errors return a plausible-but-wrong span of the right type (“annually” instead of “every four years”; “1,442” instead of “over 14,000”; “Queen Bees” taken literally instead of “women”).</w:t>
+        <w:t>Failures were overwhelmingly shared rather than model-specific (A-only failures: 3 classification / 6 QA; B-only: 2 / 4), so the patterns below describe both models. Classification: errors concentrate on figurative or contrastive positive reviews - e.g. “you'll gasp appalled and laugh outraged” (gold positive, both predicted negative) - and on sarcasm - “i'll bet the video game is a lot more fun than the film” (gold negative, both predicted positive). Both models lean on surface sentiment words; errors skew toward the positive class (A missed 19/107 positives vs. 13/93 negatives). Translation: quality is bimodal. Short, dialogue-like sentences translate acceptably while dense literary prose fails (49 of 200 sentences below chrF 20 for A, 52 for B, vs. 16/13 above chrF 50); typical errors are wrong rare vocabulary and untranslated English words carried into the output (8/200 for A, 7/200 for B). QA: both models fail on questions requiring inference or paraphrase rather than span extraction. “How/why” questions get a copied context sentence (the Antigone example in Table 6, token-F1 0.06), and several errors return a plausible-but-wrong span of the right type (“annually” instead of “every four years”; “1,442” instead of “over 14,000”; “Queen Bees” taken literally instead of “women”).</w:t>
       </w:r>
     </w:p>
     <w:p>
@@ -2948,7 +2948,7 @@
     </w:p>
     <w:p>
       <w:r>
-        <w:t>No systematic length pathology was observed. Average output lengths track the references on every task: classification outputs were exactly one word with 0% invalid labels for both models; translation averaged 14.7 (A) / 14.3 (B) words against references of ≈14.5; QA answers averaged 2.65 / 2.67 words against gold 2.85. The output caps (5/64/32 tokens) plus filtering targets to fit them meant no reference was ever unreachable and no truncated outputs were observed. Residual issues are small and worth naming: Model A produced 1 empty translation and 5 with repetition loops (Model B: 0 and 4, ≤2.5% of examples); a few translations coin non-words under vocabulary pressure (e.g. “l'évenation”), a mild form of hallucination; and 4 of Model A's QA failures were over-long context copies rather than concise answers. Classification and QA otherwise showed no hallucination — wrong answers were still drawn from the input context.</w:t>
+        <w:t>No systematic length pathology was observed. Average output lengths track the references on every task: classification outputs were exactly one word with 0% invalid labels for both models; translation averaged 14.7 (A) / 14.3 (B) words against references of ≈14.5; QA answers averaged 2.65 / 2.67 words against gold 2.85. The output caps (5/64/32 tokens) plus filtering targets to fit them meant no reference was ever unreachable and no truncated outputs were observed. Residual issues are small and worth naming: Model A produced 1 empty translation and 5 with repetition loops (Model B: 0 and 4, ≤2.5% of examples); a few translations coin non-words under vocabulary pressure (e.g. “l'évenation”), a mild form of hallucination; and 4 of Model A's QA failures were over-long context copies rather than concise answers. Classification and QA otherwise showed no hallucination. Wrong answers were still drawn from the input context.</w:t>
       </w:r>
     </w:p>
     <w:p>
@@ -2961,7 +2961,7 @@
     </w:p>
     <w:p>
       <w:r>
-        <w:t>Full fine-tuning delivered the best scores on all three tasks, but LoRA matched it to within ~1 point per task while training 42% faster, updating &lt;1% of the parameters, and producing a 59× smaller checkpoint — on this setup, the parameter-efficient method is the sensible default, and the interesting failure modes (sarcasm, literary vocabulary, inference questions) are shared properties of the base model and data scale, not of the adaptation method.</w:t>
+        <w:t>Full fine-tuning delivered the best scores on all three tasks, but LoRA matched it to within ~1 point per task while training 42% faster, updating &lt;1% of the parameters, and producing a 59× smaller checkpoint. On this setup, the parameter-efficient method is the sensible default, and the interesting failure modes (sarcasm, literary vocabulary, inference questions) are shared properties of the base model and data scale, not of the adaptation method.</w:t>
       </w:r>
     </w:p>
     <w:sectPr>

</xml_diff>